<commit_message>
fetching env variables in config
</commit_message>
<xml_diff>
--- a/backend/data/complex_sample_brds/BRD_flexibility_for_Good_Repeat_Customers.docx
+++ b/backend/data/complex_sample_brds/BRD_flexibility_for_Good_Repeat_Customers.docx
@@ -5,7 +5,7 @@
     <w:p>
       <w:r>
         <w:pict w14:anchorId="6E01D243">
-          <v:rect id="_x0000_i1211" style="width:0;height:1.5pt" o:hralign="center" o:hrstd="t" o:hr="t" fillcolor="#a0a0a0" stroked="f"/>
+          <v:rect id="_x0000_i1025" style="width:0;height:1.5pt" o:hralign="center" o:hrstd="t" o:hr="t" fillcolor="#a0a0a0" stroked="f"/>
         </w:pict>
       </w:r>
     </w:p>
@@ -67,7 +67,7 @@
     <w:p>
       <w:r>
         <w:pict w14:anchorId="56EC531E">
-          <v:rect id="_x0000_i1212" style="width:0;height:1.5pt" o:hralign="center" o:hrstd="t" o:hr="t" fillcolor="#a0a0a0" stroked="f"/>
+          <v:rect id="_x0000_i1026" style="width:0;height:1.5pt" o:hralign="center" o:hrstd="t" o:hr="t" fillcolor="#a0a0a0" stroked="f"/>
         </w:pict>
       </w:r>
     </w:p>
@@ -138,10 +138,7 @@
         </w:numPr>
       </w:pPr>
       <w:r>
-        <w:t>Introducing</w:t>
-      </w:r>
-      <w:r>
-        <w:t xml:space="preserve"> </w:t>
+        <w:t xml:space="preserve">Introducing </w:t>
       </w:r>
       <w:r>
         <w:rPr>
@@ -249,7 +246,7 @@
     <w:p>
       <w:r>
         <w:pict w14:anchorId="433D8CA0">
-          <v:rect id="_x0000_i1213" style="width:0;height:1.5pt" o:hralign="center" o:hrstd="t" o:hr="t" fillcolor="#a0a0a0" stroked="f"/>
+          <v:rect id="_x0000_i1027" style="width:0;height:1.5pt" o:hralign="center" o:hrstd="t" o:hr="t" fillcolor="#a0a0a0" stroked="f"/>
         </w:pict>
       </w:r>
     </w:p>
@@ -268,78 +265,359 @@
         <w:t>2. Definition of Repeat Good Customer</w:t>
       </w:r>
     </w:p>
+    <w:tbl>
+      <w:tblPr>
+        <w:tblW w:w="0" w:type="auto"/>
+        <w:tblCellSpacing w:w="15" w:type="dxa"/>
+        <w:tblCellMar>
+          <w:top w:w="15" w:type="dxa"/>
+          <w:left w:w="15" w:type="dxa"/>
+          <w:bottom w:w="15" w:type="dxa"/>
+          <w:right w:w="15" w:type="dxa"/>
+        </w:tblCellMar>
+        <w:tblLook w:val="04A0" w:firstRow="1" w:lastRow="0" w:firstColumn="1" w:lastColumn="0" w:noHBand="0" w:noVBand="1"/>
+      </w:tblPr>
+      <w:tblGrid>
+        <w:gridCol w:w="2559"/>
+        <w:gridCol w:w="6785"/>
+      </w:tblGrid>
+      <w:tr>
+        <w:trPr>
+          <w:tblCellSpacing w:w="15" w:type="dxa"/>
+        </w:trPr>
+        <w:tc>
+          <w:tcPr>
+            <w:tcW w:w="0" w:type="auto"/>
+            <w:tcBorders>
+              <w:top w:val="single" w:sz="6" w:space="0" w:color="E6E6E6"/>
+              <w:left w:val="single" w:sz="6" w:space="0" w:color="E6E6E6"/>
+              <w:bottom w:val="single" w:sz="6" w:space="0" w:color="E6E6E6"/>
+              <w:right w:val="single" w:sz="6" w:space="0" w:color="E6E6E6"/>
+            </w:tcBorders>
+            <w:shd w:val="clear" w:color="auto" w:fill="F5F5F5"/>
+            <w:vAlign w:val="center"/>
+            <w:hideMark/>
+          </w:tcPr>
+          <w:p>
+            <w:pPr>
+              <w:ind w:left="360"/>
+              <w:rPr>
+                <w:b/>
+                <w:bCs/>
+              </w:rPr>
+            </w:pPr>
+            <w:r>
+              <w:rPr>
+                <w:b/>
+                <w:bCs/>
+              </w:rPr>
+              <w:t>BRD Rule</w:t>
+            </w:r>
+          </w:p>
+        </w:tc>
+        <w:tc>
+          <w:tcPr>
+            <w:tcW w:w="0" w:type="auto"/>
+            <w:tcBorders>
+              <w:top w:val="single" w:sz="6" w:space="0" w:color="E6E6E6"/>
+              <w:left w:val="single" w:sz="6" w:space="0" w:color="E6E6E6"/>
+              <w:bottom w:val="single" w:sz="6" w:space="0" w:color="E6E6E6"/>
+              <w:right w:val="single" w:sz="6" w:space="0" w:color="E6E6E6"/>
+            </w:tcBorders>
+            <w:shd w:val="clear" w:color="auto" w:fill="F5F5F5"/>
+            <w:vAlign w:val="center"/>
+            <w:hideMark/>
+          </w:tcPr>
+          <w:p>
+            <w:pPr>
+              <w:ind w:left="360"/>
+              <w:rPr>
+                <w:b/>
+                <w:bCs/>
+              </w:rPr>
+            </w:pPr>
+            <w:r>
+              <w:rPr>
+                <w:b/>
+                <w:bCs/>
+              </w:rPr>
+              <w:t>JSON Implementation</w:t>
+            </w:r>
+          </w:p>
+        </w:tc>
+      </w:tr>
+      <w:tr>
+        <w:trPr>
+          <w:tblCellSpacing w:w="15" w:type="dxa"/>
+        </w:trPr>
+        <w:tc>
+          <w:tcPr>
+            <w:tcW w:w="0" w:type="auto"/>
+            <w:tcBorders>
+              <w:top w:val="single" w:sz="6" w:space="0" w:color="E6E6E6"/>
+              <w:left w:val="single" w:sz="6" w:space="0" w:color="E6E6E6"/>
+              <w:bottom w:val="single" w:sz="6" w:space="0" w:color="E6E6E6"/>
+              <w:right w:val="single" w:sz="6" w:space="0" w:color="E6E6E6"/>
+            </w:tcBorders>
+            <w:vAlign w:val="center"/>
+            <w:hideMark/>
+          </w:tcPr>
+          <w:p>
+            <w:pPr>
+              <w:ind w:left="360"/>
+            </w:pPr>
+            <w:r>
+              <w:t>Repeat customer</w:t>
+            </w:r>
+          </w:p>
+        </w:tc>
+        <w:tc>
+          <w:tcPr>
+            <w:tcW w:w="0" w:type="auto"/>
+            <w:tcBorders>
+              <w:top w:val="single" w:sz="6" w:space="0" w:color="E6E6E6"/>
+              <w:left w:val="single" w:sz="6" w:space="0" w:color="E6E6E6"/>
+              <w:bottom w:val="single" w:sz="6" w:space="0" w:color="E6E6E6"/>
+              <w:right w:val="single" w:sz="6" w:space="0" w:color="E6E6E6"/>
+            </w:tcBorders>
+            <w:vAlign w:val="center"/>
+            <w:hideMark/>
+          </w:tcPr>
+          <w:p>
+            <w:pPr>
+              <w:ind w:left="360"/>
+            </w:pPr>
+            <w:proofErr w:type="spellStart"/>
+            <w:r>
+              <w:t>repeat_type</w:t>
+            </w:r>
+            <w:proofErr w:type="spellEnd"/>
+            <w:r>
+              <w:t xml:space="preserve"> = REPEAT</w:t>
+            </w:r>
+          </w:p>
+        </w:tc>
+      </w:tr>
+      <w:tr>
+        <w:trPr>
+          <w:tblCellSpacing w:w="15" w:type="dxa"/>
+        </w:trPr>
+        <w:tc>
+          <w:tcPr>
+            <w:tcW w:w="0" w:type="auto"/>
+            <w:tcBorders>
+              <w:top w:val="single" w:sz="6" w:space="0" w:color="E6E6E6"/>
+              <w:left w:val="single" w:sz="6" w:space="0" w:color="E6E6E6"/>
+              <w:bottom w:val="single" w:sz="6" w:space="0" w:color="E6E6E6"/>
+              <w:right w:val="single" w:sz="6" w:space="0" w:color="E6E6E6"/>
+            </w:tcBorders>
+            <w:vAlign w:val="center"/>
+            <w:hideMark/>
+          </w:tcPr>
+          <w:p>
+            <w:pPr>
+              <w:ind w:left="360"/>
+            </w:pPr>
+            <w:r>
+              <w:t>No missed payments</w:t>
+            </w:r>
+          </w:p>
+        </w:tc>
+        <w:tc>
+          <w:tcPr>
+            <w:tcW w:w="0" w:type="auto"/>
+            <w:tcBorders>
+              <w:top w:val="single" w:sz="6" w:space="0" w:color="E6E6E6"/>
+              <w:left w:val="single" w:sz="6" w:space="0" w:color="E6E6E6"/>
+              <w:bottom w:val="single" w:sz="6" w:space="0" w:color="E6E6E6"/>
+              <w:right w:val="single" w:sz="6" w:space="0" w:color="E6E6E6"/>
+            </w:tcBorders>
+            <w:vAlign w:val="center"/>
+            <w:hideMark/>
+          </w:tcPr>
+          <w:p>
+            <w:pPr>
+              <w:ind w:left="360"/>
+            </w:pPr>
+            <w:r>
+              <w:t>max_dpd_last_12m = 0 AND loan_repayment_bounces_12m = 0</w:t>
+            </w:r>
+          </w:p>
+        </w:tc>
+      </w:tr>
+      <w:tr>
+        <w:trPr>
+          <w:tblCellSpacing w:w="15" w:type="dxa"/>
+        </w:trPr>
+        <w:tc>
+          <w:tcPr>
+            <w:tcW w:w="0" w:type="auto"/>
+            <w:tcBorders>
+              <w:top w:val="single" w:sz="6" w:space="0" w:color="E6E6E6"/>
+              <w:left w:val="single" w:sz="6" w:space="0" w:color="E6E6E6"/>
+              <w:bottom w:val="single" w:sz="6" w:space="0" w:color="E6E6E6"/>
+              <w:right w:val="single" w:sz="6" w:space="0" w:color="E6E6E6"/>
+            </w:tcBorders>
+            <w:vAlign w:val="center"/>
+            <w:hideMark/>
+          </w:tcPr>
+          <w:p>
+            <w:pPr>
+              <w:ind w:left="360"/>
+            </w:pPr>
+            <w:r>
+              <w:t>Positive surplus</w:t>
+            </w:r>
+          </w:p>
+        </w:tc>
+        <w:tc>
+          <w:tcPr>
+            <w:tcW w:w="0" w:type="auto"/>
+            <w:tcBorders>
+              <w:top w:val="single" w:sz="6" w:space="0" w:color="E6E6E6"/>
+              <w:left w:val="single" w:sz="6" w:space="0" w:color="E6E6E6"/>
+              <w:bottom w:val="single" w:sz="6" w:space="0" w:color="E6E6E6"/>
+              <w:right w:val="single" w:sz="6" w:space="0" w:color="E6E6E6"/>
+            </w:tcBorders>
+            <w:vAlign w:val="center"/>
+            <w:hideMark/>
+          </w:tcPr>
+          <w:p>
+            <w:pPr>
+              <w:ind w:left="360"/>
+            </w:pPr>
+            <w:proofErr w:type="spellStart"/>
+            <w:r>
+              <w:t>net_monthly_surplus</w:t>
+            </w:r>
+            <w:proofErr w:type="spellEnd"/>
+            <w:r>
+              <w:t xml:space="preserve"> &gt; 0</w:t>
+            </w:r>
+          </w:p>
+        </w:tc>
+      </w:tr>
+      <w:tr>
+        <w:trPr>
+          <w:tblCellSpacing w:w="15" w:type="dxa"/>
+        </w:trPr>
+        <w:tc>
+          <w:tcPr>
+            <w:tcW w:w="0" w:type="auto"/>
+            <w:tcBorders>
+              <w:top w:val="single" w:sz="6" w:space="0" w:color="E6E6E6"/>
+              <w:left w:val="single" w:sz="6" w:space="0" w:color="E6E6E6"/>
+              <w:bottom w:val="single" w:sz="6" w:space="0" w:color="E6E6E6"/>
+              <w:right w:val="single" w:sz="6" w:space="0" w:color="E6E6E6"/>
+            </w:tcBorders>
+            <w:vAlign w:val="center"/>
+            <w:hideMark/>
+          </w:tcPr>
+          <w:p>
+            <w:pPr>
+              <w:ind w:left="360"/>
+            </w:pPr>
+            <w:r>
+              <w:lastRenderedPageBreak/>
+              <w:t>Stable banking</w:t>
+            </w:r>
+          </w:p>
+        </w:tc>
+        <w:tc>
+          <w:tcPr>
+            <w:tcW w:w="0" w:type="auto"/>
+            <w:tcBorders>
+              <w:top w:val="single" w:sz="6" w:space="0" w:color="E6E6E6"/>
+              <w:left w:val="single" w:sz="6" w:space="0" w:color="E6E6E6"/>
+              <w:bottom w:val="single" w:sz="6" w:space="0" w:color="E6E6E6"/>
+              <w:right w:val="single" w:sz="6" w:space="0" w:color="E6E6E6"/>
+            </w:tcBorders>
+            <w:vAlign w:val="center"/>
+            <w:hideMark/>
+          </w:tcPr>
+          <w:p>
+            <w:pPr>
+              <w:ind w:left="360"/>
+            </w:pPr>
+            <w:r>
+              <w:t xml:space="preserve">salary_credit_consistency_6m &gt; </w:t>
+            </w:r>
+            <w:r>
+              <w:t>0.75</w:t>
+            </w:r>
+          </w:p>
+        </w:tc>
+      </w:tr>
+      <w:tr>
+        <w:trPr>
+          <w:tblCellSpacing w:w="15" w:type="dxa"/>
+        </w:trPr>
+        <w:tc>
+          <w:tcPr>
+            <w:tcW w:w="0" w:type="auto"/>
+            <w:tcBorders>
+              <w:top w:val="single" w:sz="6" w:space="0" w:color="E6E6E6"/>
+              <w:left w:val="single" w:sz="6" w:space="0" w:color="E6E6E6"/>
+              <w:bottom w:val="single" w:sz="6" w:space="0" w:color="E6E6E6"/>
+              <w:right w:val="single" w:sz="6" w:space="0" w:color="E6E6E6"/>
+            </w:tcBorders>
+            <w:vAlign w:val="center"/>
+            <w:hideMark/>
+          </w:tcPr>
+          <w:p>
+            <w:pPr>
+              <w:ind w:left="360"/>
+            </w:pPr>
+            <w:r>
+              <w:t>No negative bureau</w:t>
+            </w:r>
+          </w:p>
+        </w:tc>
+        <w:tc>
+          <w:tcPr>
+            <w:tcW w:w="0" w:type="auto"/>
+            <w:tcBorders>
+              <w:top w:val="single" w:sz="6" w:space="0" w:color="E6E6E6"/>
+              <w:left w:val="single" w:sz="6" w:space="0" w:color="E6E6E6"/>
+              <w:bottom w:val="single" w:sz="6" w:space="0" w:color="E6E6E6"/>
+              <w:right w:val="single" w:sz="6" w:space="0" w:color="E6E6E6"/>
+            </w:tcBorders>
+            <w:vAlign w:val="center"/>
+            <w:hideMark/>
+          </w:tcPr>
+          <w:p>
+            <w:pPr>
+              <w:ind w:left="360"/>
+            </w:pPr>
+            <w:proofErr w:type="spellStart"/>
+            <w:r>
+              <w:t>overdue_accounts</w:t>
+            </w:r>
+            <w:proofErr w:type="spellEnd"/>
+            <w:r>
+              <w:t xml:space="preserve"> = 0, </w:t>
+            </w:r>
+            <w:proofErr w:type="spellStart"/>
+            <w:r>
+              <w:t>bankruptcy_flag</w:t>
+            </w:r>
+            <w:proofErr w:type="spellEnd"/>
+            <w:r>
+              <w:t xml:space="preserve"> = false</w:t>
+            </w:r>
+          </w:p>
+        </w:tc>
+      </w:tr>
+    </w:tbl>
     <w:p>
-      <w:r>
-        <w:t>A repeat customer is classified as**“</w:t>
-      </w:r>
-      <w:proofErr w:type="gramStart"/>
-      <w:r>
-        <w:t>Good”*</w:t>
-      </w:r>
-      <w:proofErr w:type="gramEnd"/>
-      <w:r>
-        <w:t>* if all the following conditions are satisfied:</w:t>
-      </w:r>
+      <w:pPr>
+        <w:ind w:left="360"/>
+      </w:pPr>
     </w:p>
     <w:p>
-      <w:pPr>
-        <w:numPr>
-          <w:ilvl w:val="0"/>
-          <w:numId w:val="3"/>
-        </w:numPr>
-      </w:pPr>
-      <w:r>
-        <w:t>No missed or delayed repayments in recent loan history</w:t>
-      </w:r>
-    </w:p>
-    <w:p>
-      <w:pPr>
-        <w:numPr>
-          <w:ilvl w:val="0"/>
-          <w:numId w:val="3"/>
-        </w:numPr>
-      </w:pPr>
-      <w:r>
-        <w:t>Stable or improving debt-to-income profile</w:t>
-      </w:r>
-    </w:p>
-    <w:p>
-      <w:pPr>
-        <w:numPr>
-          <w:ilvl w:val="0"/>
-          <w:numId w:val="3"/>
-        </w:numPr>
-      </w:pPr>
-      <w:r>
-        <w:t>Positive and sustainable monthly surplus after obligations</w:t>
-      </w:r>
-    </w:p>
-    <w:p>
-      <w:pPr>
-        <w:numPr>
-          <w:ilvl w:val="0"/>
-          <w:numId w:val="3"/>
-        </w:numPr>
-      </w:pPr>
-      <w:r>
-        <w:t>Consistent banking behavior and income flows</w:t>
-      </w:r>
-    </w:p>
-    <w:p>
-      <w:pPr>
-        <w:numPr>
-          <w:ilvl w:val="0"/>
-          <w:numId w:val="3"/>
-        </w:numPr>
-      </w:pPr>
-      <w:r>
-        <w:t>No adverse credit bureau signals in the last 12 months</w:t>
-      </w:r>
-    </w:p>
-    <w:p>
       <w:r>
         <w:pict w14:anchorId="2B48B117">
-          <v:rect id="_x0000_i1214" style="width:0;height:1.5pt" o:hralign="center" o:hrstd="t" o:hr="t" fillcolor="#a0a0a0" stroked="f"/>
+          <v:rect id="_x0000_i1028" style="width:0;height:1.5pt" o:hralign="center" o:hrstd="t" o:hr="t" fillcolor="#a0a0a0" stroked="f"/>
         </w:pict>
       </w:r>
     </w:p>
@@ -355,7 +633,6 @@
           <w:b/>
           <w:bCs/>
         </w:rPr>
-        <w:lastRenderedPageBreak/>
         <w:t>3. Customer Segmentation (4-Tier Structure)</w:t>
       </w:r>
     </w:p>
@@ -377,7 +654,7 @@
     <w:p>
       <w:r>
         <w:pict w14:anchorId="1EBE8677">
-          <v:rect id="_x0000_i1215" style="width:0;height:1.5pt" o:hralign="center" o:hrstd="t" o:hr="t" fillcolor="#a0a0a0" stroked="f"/>
+          <v:rect id="_x0000_i1029" style="width:0;height:1.5pt" o:hralign="center" o:hrstd="t" o:hr="t" fillcolor="#a0a0a0" stroked="f"/>
         </w:pict>
       </w:r>
     </w:p>
@@ -393,41 +670,160 @@
           <w:b/>
           <w:bCs/>
         </w:rPr>
-        <w:t>Segment A – Elite Customers</w:t>
+        <w:t xml:space="preserve">Segment </w:t>
+      </w:r>
+      <w:proofErr w:type="gramStart"/>
+      <w:r>
+        <w:rPr>
+          <w:b/>
+          <w:bCs/>
+        </w:rPr>
+        <w:t>A</w:t>
+      </w:r>
+      <w:r>
+        <w:t xml:space="preserve">  </w:t>
+      </w:r>
+      <w:r>
+        <w:rPr>
+          <w:b/>
+          <w:bCs/>
+        </w:rPr>
+        <w:t>–</w:t>
+      </w:r>
+      <w:proofErr w:type="gramEnd"/>
+      <w:r>
+        <w:rPr>
+          <w:b/>
+          <w:bCs/>
+        </w:rPr>
+        <w:t xml:space="preserve"> Elite Customers</w:t>
       </w:r>
     </w:p>
     <w:p>
       <w:pPr>
+        <w:pStyle w:val="ListParagraph"/>
         <w:numPr>
           <w:ilvl w:val="0"/>
-          <w:numId w:val="4"/>
+          <w:numId w:val="31"/>
         </w:numPr>
       </w:pPr>
-      <w:r>
-        <w:t>Excellent credit profile</w:t>
+      <w:proofErr w:type="spellStart"/>
+      <w:r>
+        <w:t>repeat_type</w:t>
+      </w:r>
+      <w:proofErr w:type="spellEnd"/>
+      <w:r>
+        <w:t xml:space="preserve"> = REPEAT</w:t>
       </w:r>
     </w:p>
     <w:p>
       <w:pPr>
+        <w:pStyle w:val="ListParagraph"/>
         <w:numPr>
           <w:ilvl w:val="0"/>
-          <w:numId w:val="4"/>
+          <w:numId w:val="31"/>
         </w:numPr>
       </w:pPr>
       <w:r>
-        <w:t>Low leverage (low debt-to-income)</w:t>
+        <w:t>max_dpd_last_12m = 0</w:t>
       </w:r>
     </w:p>
     <w:p>
       <w:pPr>
+        <w:pStyle w:val="ListParagraph"/>
         <w:numPr>
           <w:ilvl w:val="0"/>
-          <w:numId w:val="4"/>
+          <w:numId w:val="31"/>
         </w:numPr>
       </w:pPr>
       <w:r>
-        <w:t>High surplus income</w:t>
-      </w:r>
+        <w:t>loan_repayment_bounces_12m = 0</w:t>
+      </w:r>
+    </w:p>
+    <w:p>
+      <w:pPr>
+        <w:pStyle w:val="ListParagraph"/>
+        <w:numPr>
+          <w:ilvl w:val="0"/>
+          <w:numId w:val="31"/>
+        </w:numPr>
+      </w:pPr>
+      <w:proofErr w:type="spellStart"/>
+      <w:r>
+        <w:t>net_monthly_surplus</w:t>
+      </w:r>
+      <w:proofErr w:type="spellEnd"/>
+      <w:r>
+        <w:t xml:space="preserve"> &gt; 0</w:t>
+      </w:r>
+    </w:p>
+    <w:p>
+      <w:pPr>
+        <w:pStyle w:val="ListParagraph"/>
+        <w:numPr>
+          <w:ilvl w:val="0"/>
+          <w:numId w:val="31"/>
+        </w:numPr>
+      </w:pPr>
+      <w:proofErr w:type="spellStart"/>
+      <w:r>
+        <w:t>overdue_accounts</w:t>
+      </w:r>
+      <w:proofErr w:type="spellEnd"/>
+      <w:r>
+        <w:t xml:space="preserve"> = 0</w:t>
+      </w:r>
+    </w:p>
+    <w:p>
+      <w:pPr>
+        <w:pStyle w:val="ListParagraph"/>
+        <w:numPr>
+          <w:ilvl w:val="0"/>
+          <w:numId w:val="31"/>
+        </w:numPr>
+      </w:pPr>
+      <w:proofErr w:type="spellStart"/>
+      <w:r>
+        <w:t>bankruptcy_flag</w:t>
+      </w:r>
+      <w:proofErr w:type="spellEnd"/>
+      <w:r>
+        <w:t xml:space="preserve"> = false</w:t>
+      </w:r>
+    </w:p>
+    <w:p>
+      <w:pPr>
+        <w:pStyle w:val="ListParagraph"/>
+        <w:numPr>
+          <w:ilvl w:val="0"/>
+          <w:numId w:val="31"/>
+        </w:numPr>
+      </w:pPr>
+      <w:r>
+        <w:t>salary_credit_consistency_6m ≥ 0.80</w:t>
+      </w:r>
+    </w:p>
+    <w:p>
+      <w:pPr>
+        <w:pStyle w:val="ListParagraph"/>
+        <w:numPr>
+          <w:ilvl w:val="0"/>
+          <w:numId w:val="31"/>
+        </w:numPr>
+      </w:pPr>
+      <w:proofErr w:type="spellStart"/>
+      <w:r>
+        <w:t>credit_risk_band</w:t>
+      </w:r>
+      <w:proofErr w:type="spellEnd"/>
+      <w:r>
+        <w:t xml:space="preserve"> = LOW</w:t>
+      </w:r>
+    </w:p>
+    <w:p>
+      <w:pPr>
+        <w:ind w:left="720"/>
+      </w:pPr>
     </w:p>
     <w:p>
       <w:r>
@@ -438,13 +834,16 @@
         <w:t>Risk Profile:</w:t>
       </w:r>
       <w:r>
-        <w:t xml:space="preserve"> Very Low</w:t>
+        <w:t xml:space="preserve"> </w:t>
+      </w:r>
+      <w:r>
+        <w:t>LOW</w:t>
       </w:r>
     </w:p>
     <w:p>
       <w:r>
         <w:pict w14:anchorId="0E39452C">
-          <v:rect id="_x0000_i1216" style="width:0;height:1.5pt" o:hralign="center" o:hrstd="t" o:hr="t" fillcolor="#a0a0a0" stroked="f"/>
+          <v:rect id="_x0000_i1030" style="width:0;height:1.5pt" o:hralign="center" o:hrstd="t" o:hr="t" fillcolor="#a0a0a0" stroked="f"/>
         </w:pict>
       </w:r>
     </w:p>
@@ -465,35 +864,122 @@
     </w:p>
     <w:p>
       <w:pPr>
+        <w:pStyle w:val="ListParagraph"/>
         <w:numPr>
           <w:ilvl w:val="0"/>
-          <w:numId w:val="5"/>
+          <w:numId w:val="33"/>
         </w:numPr>
       </w:pPr>
       <w:r>
-        <w:t>Strong creditworthiness</w:t>
+        <w:t xml:space="preserve">720 ≤ </w:t>
+      </w:r>
+      <w:proofErr w:type="spellStart"/>
+      <w:r>
+        <w:t>bureau_score</w:t>
+      </w:r>
+      <w:proofErr w:type="spellEnd"/>
+      <w:r>
+        <w:t xml:space="preserve"> &lt; 760</w:t>
       </w:r>
     </w:p>
     <w:p>
       <w:pPr>
+        <w:pStyle w:val="ListParagraph"/>
         <w:numPr>
           <w:ilvl w:val="0"/>
-          <w:numId w:val="5"/>
+          <w:numId w:val="33"/>
         </w:numPr>
       </w:pPr>
-      <w:r>
-        <w:t>Moderate leverage</w:t>
+      <w:proofErr w:type="spellStart"/>
+      <w:r>
+        <w:t>debt_to_income_ratio</w:t>
+      </w:r>
+      <w:proofErr w:type="spellEnd"/>
+      <w:r>
+        <w:t xml:space="preserve"> </w:t>
+      </w:r>
+      <w:r>
+        <w:t>≤ 0.40</w:t>
       </w:r>
     </w:p>
     <w:p>
       <w:pPr>
+        <w:pStyle w:val="ListParagraph"/>
         <w:numPr>
           <w:ilvl w:val="0"/>
-          <w:numId w:val="5"/>
+          <w:numId w:val="33"/>
         </w:numPr>
       </w:pPr>
-      <w:r>
-        <w:t>Stable income</w:t>
+      <w:proofErr w:type="spellStart"/>
+      <w:r>
+        <w:t>net_monthly_surplus</w:t>
+      </w:r>
+      <w:proofErr w:type="spellEnd"/>
+      <w:r>
+        <w:t xml:space="preserve"> ≥ 1500</w:t>
+      </w:r>
+    </w:p>
+    <w:p>
+      <w:pPr>
+        <w:pStyle w:val="ListParagraph"/>
+        <w:numPr>
+          <w:ilvl w:val="0"/>
+          <w:numId w:val="33"/>
+        </w:numPr>
+      </w:pPr>
+      <w:proofErr w:type="spellStart"/>
+      <w:r>
+        <w:t>banking_stability_index</w:t>
+      </w:r>
+      <w:proofErr w:type="spellEnd"/>
+      <w:r>
+        <w:t xml:space="preserve"> ≥ 0.70</w:t>
+      </w:r>
+    </w:p>
+    <w:p>
+      <w:pPr>
+        <w:pStyle w:val="ListParagraph"/>
+        <w:numPr>
+          <w:ilvl w:val="0"/>
+          <w:numId w:val="33"/>
+        </w:numPr>
+      </w:pPr>
+      <w:r>
+        <w:t>max_dpd_last_12m ≤ 30</w:t>
+      </w:r>
+    </w:p>
+    <w:p>
+      <w:pPr>
+        <w:pStyle w:val="ListParagraph"/>
+        <w:numPr>
+          <w:ilvl w:val="0"/>
+          <w:numId w:val="33"/>
+        </w:numPr>
+      </w:pPr>
+      <w:proofErr w:type="spellStart"/>
+      <w:r>
+        <w:t>credit_utilization</w:t>
+      </w:r>
+      <w:proofErr w:type="spellEnd"/>
+      <w:r>
+        <w:t xml:space="preserve"> ≤ 0.50</w:t>
+      </w:r>
+    </w:p>
+    <w:p>
+      <w:pPr>
+        <w:pStyle w:val="ListParagraph"/>
+        <w:numPr>
+          <w:ilvl w:val="0"/>
+          <w:numId w:val="33"/>
+        </w:numPr>
+      </w:pPr>
+      <w:proofErr w:type="spellStart"/>
+      <w:r>
+        <w:t>credit_risk_band</w:t>
+      </w:r>
+      <w:proofErr w:type="spellEnd"/>
+      <w:r>
+        <w:t xml:space="preserve"> = MEDIUM</w:t>
       </w:r>
     </w:p>
     <w:p>
@@ -505,13 +991,17 @@
         <w:t>Risk Profile:</w:t>
       </w:r>
       <w:r>
-        <w:t xml:space="preserve"> Low</w:t>
+        <w:t xml:space="preserve"> </w:t>
+      </w:r>
+      <w:r>
+        <w:t>MEDIUM</w:t>
       </w:r>
     </w:p>
     <w:p>
       <w:r>
+        <w:lastRenderedPageBreak/>
         <w:pict w14:anchorId="461F5677">
-          <v:rect id="_x0000_i1217" style="width:0;height:1.5pt" o:hralign="center" o:hrstd="t" o:hr="t" fillcolor="#a0a0a0" stroked="f"/>
+          <v:rect id="_x0000_i1031" style="width:0;height:1.5pt" o:hralign="center" o:hrstd="t" o:hr="t" fillcolor="#a0a0a0" stroked="f"/>
         </w:pict>
       </w:r>
     </w:p>
@@ -532,35 +1022,122 @@
     </w:p>
     <w:p>
       <w:pPr>
+        <w:pStyle w:val="ListParagraph"/>
         <w:numPr>
           <w:ilvl w:val="0"/>
-          <w:numId w:val="6"/>
+          <w:numId w:val="34"/>
         </w:numPr>
       </w:pPr>
       <w:r>
-        <w:t>Moderate credit profile</w:t>
+        <w:t xml:space="preserve">660 ≤ </w:t>
+      </w:r>
+      <w:proofErr w:type="spellStart"/>
+      <w:r>
+        <w:t>bureau_score</w:t>
+      </w:r>
+      <w:proofErr w:type="spellEnd"/>
+      <w:r>
+        <w:t xml:space="preserve"> &lt; 720</w:t>
       </w:r>
     </w:p>
     <w:p>
       <w:pPr>
+        <w:pStyle w:val="ListParagraph"/>
         <w:numPr>
           <w:ilvl w:val="0"/>
-          <w:numId w:val="6"/>
+          <w:numId w:val="34"/>
         </w:numPr>
       </w:pPr>
-      <w:r>
-        <w:t>Higher leverage but manageable</w:t>
+      <w:proofErr w:type="spellStart"/>
+      <w:r>
+        <w:t>debt_to_income_ratio</w:t>
+      </w:r>
+      <w:proofErr w:type="spellEnd"/>
+      <w:r>
+        <w:t xml:space="preserve"> </w:t>
+      </w:r>
+      <w:r>
+        <w:t>≤ 0.50</w:t>
       </w:r>
     </w:p>
     <w:p>
       <w:pPr>
+        <w:pStyle w:val="ListParagraph"/>
         <w:numPr>
           <w:ilvl w:val="0"/>
-          <w:numId w:val="6"/>
+          <w:numId w:val="34"/>
         </w:numPr>
       </w:pPr>
-      <w:r>
-        <w:t>Improving repayment behavior</w:t>
+      <w:proofErr w:type="spellStart"/>
+      <w:r>
+        <w:t>net_monthly_surplus</w:t>
+      </w:r>
+      <w:proofErr w:type="spellEnd"/>
+      <w:r>
+        <w:t xml:space="preserve"> ≥ 500</w:t>
+      </w:r>
+    </w:p>
+    <w:p>
+      <w:pPr>
+        <w:pStyle w:val="ListParagraph"/>
+        <w:numPr>
+          <w:ilvl w:val="0"/>
+          <w:numId w:val="34"/>
+        </w:numPr>
+      </w:pPr>
+      <w:proofErr w:type="spellStart"/>
+      <w:r>
+        <w:t>banking_stability_index</w:t>
+      </w:r>
+      <w:proofErr w:type="spellEnd"/>
+      <w:r>
+        <w:t xml:space="preserve"> ≥ 0.60</w:t>
+      </w:r>
+    </w:p>
+    <w:p>
+      <w:pPr>
+        <w:pStyle w:val="ListParagraph"/>
+        <w:numPr>
+          <w:ilvl w:val="0"/>
+          <w:numId w:val="34"/>
+        </w:numPr>
+      </w:pPr>
+      <w:r>
+        <w:t>max_dpd_last_12m ≤ 60</w:t>
+      </w:r>
+    </w:p>
+    <w:p>
+      <w:pPr>
+        <w:pStyle w:val="ListParagraph"/>
+        <w:numPr>
+          <w:ilvl w:val="0"/>
+          <w:numId w:val="34"/>
+        </w:numPr>
+      </w:pPr>
+      <w:proofErr w:type="spellStart"/>
+      <w:r>
+        <w:t>credit_utilization</w:t>
+      </w:r>
+      <w:proofErr w:type="spellEnd"/>
+      <w:r>
+        <w:t xml:space="preserve"> ≤ 0.70</w:t>
+      </w:r>
+    </w:p>
+    <w:p>
+      <w:pPr>
+        <w:pStyle w:val="ListParagraph"/>
+        <w:numPr>
+          <w:ilvl w:val="0"/>
+          <w:numId w:val="34"/>
+        </w:numPr>
+      </w:pPr>
+      <w:proofErr w:type="spellStart"/>
+      <w:r>
+        <w:t>credit_risk_band</w:t>
+      </w:r>
+      <w:proofErr w:type="spellEnd"/>
+      <w:r>
+        <w:t xml:space="preserve"> = HIGH</w:t>
       </w:r>
     </w:p>
     <w:p>
@@ -572,70 +1149,16 @@
         <w:t>Risk Profile:</w:t>
       </w:r>
       <w:r>
-        <w:t xml:space="preserve"> Medium</w:t>
+        <w:t xml:space="preserve"> </w:t>
+      </w:r>
+      <w:r>
+        <w:t>HIGH</w:t>
       </w:r>
     </w:p>
     <w:p>
       <w:r>
-        <w:pict w14:anchorId="3B44F6E3">
-          <v:rect id="_x0000_i1218" style="width:0;height:1.5pt" o:hralign="center" o:hrstd="t" o:hr="t" fillcolor="#a0a0a0" stroked="f"/>
-        </w:pict>
-      </w:r>
-    </w:p>
-    <w:p>
-      <w:pPr>
-        <w:rPr>
-          <w:b/>
-          <w:bCs/>
-        </w:rPr>
-      </w:pPr>
-      <w:r>
-        <w:rPr>
-          <w:b/>
-          <w:bCs/>
-        </w:rPr>
-        <w:t>Segment D – Controlled Risk Customers</w:t>
-      </w:r>
-    </w:p>
-    <w:p>
-      <w:pPr>
-        <w:numPr>
-          <w:ilvl w:val="0"/>
-          <w:numId w:val="7"/>
-        </w:numPr>
-      </w:pPr>
-      <w:r>
-        <w:t>Weak or borderline credit</w:t>
-      </w:r>
-    </w:p>
-    <w:p>
-      <w:pPr>
-        <w:numPr>
-          <w:ilvl w:val="0"/>
-          <w:numId w:val="7"/>
-        </w:numPr>
-      </w:pPr>
-      <w:r>
-        <w:t>Higher leverage or inconsistencies</w:t>
-      </w:r>
-    </w:p>
-    <w:p>
-      <w:r>
-        <w:rPr>
-          <w:b/>
-          <w:bCs/>
-        </w:rPr>
-        <w:t>Risk Profile:</w:t>
-      </w:r>
-      <w:r>
-        <w:t xml:space="preserve"> Controlled / Restricted</w:t>
-      </w:r>
-    </w:p>
-    <w:p>
-      <w:r>
-        <w:lastRenderedPageBreak/>
         <w:pict w14:anchorId="5FC02C45">
-          <v:rect id="_x0000_i1219" style="width:0;height:1.5pt" o:hralign="center" o:hrstd="t" o:hr="t" fillcolor="#a0a0a0" stroked="f"/>
+          <v:rect id="_x0000_i1032" style="width:0;height:1.5pt" o:hralign="center" o:hrstd="t" o:hr="t" fillcolor="#a0a0a0" stroked="f"/>
         </w:pict>
       </w:r>
     </w:p>
@@ -903,7 +1426,7 @@
                 <w:b/>
                 <w:bCs/>
               </w:rPr>
-              <w:t>10% increase</w:t>
+              <w:t>10% reduction</w:t>
             </w:r>
           </w:p>
         </w:tc>
@@ -924,11 +1447,7 @@
             <w:vAlign w:val="center"/>
             <w:hideMark/>
           </w:tcPr>
-          <w:p>
-            <w:r>
-              <w:t>Segment D</w:t>
-            </w:r>
-          </w:p>
+          <w:p/>
         </w:tc>
         <w:tc>
           <w:tcPr>
@@ -942,25 +1461,14 @@
             <w:vAlign w:val="center"/>
             <w:hideMark/>
           </w:tcPr>
-          <w:p>
-            <w:r>
-              <w:t xml:space="preserve">Up to </w:t>
-            </w:r>
-            <w:r>
-              <w:rPr>
-                <w:b/>
-                <w:bCs/>
-              </w:rPr>
-              <w:t>10% reduction</w:t>
-            </w:r>
-          </w:p>
+          <w:p/>
         </w:tc>
       </w:tr>
     </w:tbl>
     <w:p>
       <w:r>
         <w:pict w14:anchorId="6A6F29AE">
-          <v:rect id="_x0000_i1220" style="width:0;height:1.5pt" o:hralign="center" o:hrstd="t" o:hr="t" fillcolor="#a0a0a0" stroked="f"/>
+          <v:rect id="_x0000_i1033" style="width:0;height:1.5pt" o:hralign="center" o:hrstd="t" o:hr="t" fillcolor="#a0a0a0" stroked="f"/>
         </w:pict>
       </w:r>
     </w:p>
@@ -1018,7 +1526,7 @@
     <w:p>
       <w:r>
         <w:pict w14:anchorId="459EF784">
-          <v:rect id="_x0000_i1221" style="width:0;height:1.5pt" o:hralign="center" o:hrstd="t" o:hr="t" fillcolor="#a0a0a0" stroked="f"/>
+          <v:rect id="_x0000_i1034" style="width:0;height:1.5pt" o:hralign="center" o:hrstd="t" o:hr="t" fillcolor="#a0a0a0" stroked="f"/>
         </w:pict>
       </w:r>
     </w:p>
@@ -1088,6 +1596,7 @@
                 <w:b/>
                 <w:bCs/>
               </w:rPr>
+              <w:lastRenderedPageBreak/>
               <w:t>Segment</w:t>
             </w:r>
           </w:p>
@@ -1257,11 +1766,14 @@
               <w:t xml:space="preserve">Up to </w:t>
             </w:r>
             <w:r>
+              <w:t>36</w:t>
+            </w:r>
+            <w:r>
               <w:rPr>
                 <w:b/>
                 <w:bCs/>
               </w:rPr>
-              <w:t>48 months</w:t>
+              <w:t xml:space="preserve"> months</w:t>
             </w:r>
           </w:p>
         </w:tc>
@@ -1282,11 +1794,7 @@
             <w:vAlign w:val="center"/>
             <w:hideMark/>
           </w:tcPr>
-          <w:p>
-            <w:r>
-              <w:t>Segment D</w:t>
-            </w:r>
-          </w:p>
+          <w:p/>
         </w:tc>
         <w:tc>
           <w:tcPr>
@@ -1300,25 +1808,14 @@
             <w:vAlign w:val="center"/>
             <w:hideMark/>
           </w:tcPr>
-          <w:p>
-            <w:r>
-              <w:t xml:space="preserve">Up to </w:t>
-            </w:r>
-            <w:r>
-              <w:rPr>
-                <w:b/>
-                <w:bCs/>
-              </w:rPr>
-              <w:t>36 months</w:t>
-            </w:r>
-          </w:p>
+          <w:p/>
         </w:tc>
       </w:tr>
     </w:tbl>
     <w:p>
       <w:r>
         <w:pict w14:anchorId="7E8A4DBA">
-          <v:rect id="_x0000_i1222" style="width:0;height:1.5pt" o:hralign="center" o:hrstd="t" o:hr="t" fillcolor="#a0a0a0" stroked="f"/>
+          <v:rect id="_x0000_i1035" style="width:0;height:1.5pt" o:hralign="center" o:hrstd="t" o:hr="t" fillcolor="#a0a0a0" stroked="f"/>
         </w:pict>
       </w:r>
     </w:p>
@@ -1363,7 +1860,6 @@
         </w:numPr>
       </w:pPr>
       <w:r>
-        <w:lastRenderedPageBreak/>
         <w:t xml:space="preserve">Longer tenure is primarily used for </w:t>
       </w:r>
       <w:r>
@@ -1377,7 +1873,7 @@
     <w:p>
       <w:r>
         <w:pict w14:anchorId="1AD4E36A">
-          <v:rect id="_x0000_i1223" style="width:0;height:1.5pt" o:hralign="center" o:hrstd="t" o:hr="t" fillcolor="#a0a0a0" stroked="f"/>
+          <v:rect id="_x0000_i1036" style="width:0;height:1.5pt" o:hralign="center" o:hrstd="t" o:hr="t" fillcolor="#a0a0a0" stroked="f"/>
         </w:pict>
       </w:r>
     </w:p>
@@ -1606,7 +2102,7 @@
           </w:tcPr>
           <w:p>
             <w:r>
-              <w:t>Minimal reduction (up to ~0.5%)</w:t>
+              <w:t>No pricing benefit</w:t>
             </w:r>
           </w:p>
         </w:tc>
@@ -1627,11 +2123,7 @@
             <w:vAlign w:val="center"/>
             <w:hideMark/>
           </w:tcPr>
-          <w:p>
-            <w:r>
-              <w:t>Segment D</w:t>
-            </w:r>
-          </w:p>
+          <w:p/>
         </w:tc>
         <w:tc>
           <w:tcPr>
@@ -1645,18 +2137,14 @@
             <w:vAlign w:val="center"/>
             <w:hideMark/>
           </w:tcPr>
-          <w:p>
-            <w:r>
-              <w:t>No pricing benefit</w:t>
-            </w:r>
-          </w:p>
+          <w:p/>
         </w:tc>
       </w:tr>
     </w:tbl>
     <w:p>
       <w:r>
         <w:pict w14:anchorId="7425234F">
-          <v:rect id="_x0000_i1224" style="width:0;height:1.5pt" o:hralign="center" o:hrstd="t" o:hr="t" fillcolor="#a0a0a0" stroked="f"/>
+          <v:rect id="_x0000_i1037" style="width:0;height:1.5pt" o:hralign="center" o:hrstd="t" o:hr="t" fillcolor="#a0a0a0" stroked="f"/>
         </w:pict>
       </w:r>
     </w:p>
@@ -1711,7 +2199,7 @@
     <w:p>
       <w:r>
         <w:pict w14:anchorId="4FC88AAE">
-          <v:rect id="_x0000_i1225" style="width:0;height:1.5pt" o:hralign="center" o:hrstd="t" o:hr="t" fillcolor="#a0a0a0" stroked="f"/>
+          <v:rect id="_x0000_i1038" style="width:0;height:1.5pt" o:hralign="center" o:hrstd="t" o:hr="t" fillcolor="#a0a0a0" stroked="f"/>
         </w:pict>
       </w:r>
     </w:p>
@@ -3070,6 +3558,119 @@
     </w:lvl>
   </w:abstractNum>
   <w:abstractNum w:abstractNumId="9" w15:restartNumberingAfterBreak="0">
+    <w:nsid w:val="1A305FC9"/>
+    <w:multiLevelType w:val="hybridMultilevel"/>
+    <w:tmpl w:val="FF32B60C"/>
+    <w:lvl w:ilvl="0" w:tplc="04090001">
+      <w:start w:val="1"/>
+      <w:numFmt w:val="bullet"/>
+      <w:lvlText w:val=""/>
+      <w:lvlJc w:val="left"/>
+      <w:pPr>
+        <w:ind w:left="720" w:hanging="360"/>
+      </w:pPr>
+      <w:rPr>
+        <w:rFonts w:ascii="Symbol" w:hAnsi="Symbol" w:hint="default"/>
+      </w:rPr>
+    </w:lvl>
+    <w:lvl w:ilvl="1" w:tplc="04090003" w:tentative="1">
+      <w:start w:val="1"/>
+      <w:numFmt w:val="bullet"/>
+      <w:lvlText w:val="o"/>
+      <w:lvlJc w:val="left"/>
+      <w:pPr>
+        <w:ind w:left="1440" w:hanging="360"/>
+      </w:pPr>
+      <w:rPr>
+        <w:rFonts w:ascii="Courier New" w:hAnsi="Courier New" w:cs="Courier New" w:hint="default"/>
+      </w:rPr>
+    </w:lvl>
+    <w:lvl w:ilvl="2" w:tplc="04090005" w:tentative="1">
+      <w:start w:val="1"/>
+      <w:numFmt w:val="bullet"/>
+      <w:lvlText w:val=""/>
+      <w:lvlJc w:val="left"/>
+      <w:pPr>
+        <w:ind w:left="2160" w:hanging="360"/>
+      </w:pPr>
+      <w:rPr>
+        <w:rFonts w:ascii="Wingdings" w:hAnsi="Wingdings" w:hint="default"/>
+      </w:rPr>
+    </w:lvl>
+    <w:lvl w:ilvl="3" w:tplc="04090001" w:tentative="1">
+      <w:start w:val="1"/>
+      <w:numFmt w:val="bullet"/>
+      <w:lvlText w:val=""/>
+      <w:lvlJc w:val="left"/>
+      <w:pPr>
+        <w:ind w:left="2880" w:hanging="360"/>
+      </w:pPr>
+      <w:rPr>
+        <w:rFonts w:ascii="Symbol" w:hAnsi="Symbol" w:hint="default"/>
+      </w:rPr>
+    </w:lvl>
+    <w:lvl w:ilvl="4" w:tplc="04090003" w:tentative="1">
+      <w:start w:val="1"/>
+      <w:numFmt w:val="bullet"/>
+      <w:lvlText w:val="o"/>
+      <w:lvlJc w:val="left"/>
+      <w:pPr>
+        <w:ind w:left="3600" w:hanging="360"/>
+      </w:pPr>
+      <w:rPr>
+        <w:rFonts w:ascii="Courier New" w:hAnsi="Courier New" w:cs="Courier New" w:hint="default"/>
+      </w:rPr>
+    </w:lvl>
+    <w:lvl w:ilvl="5" w:tplc="04090005" w:tentative="1">
+      <w:start w:val="1"/>
+      <w:numFmt w:val="bullet"/>
+      <w:lvlText w:val=""/>
+      <w:lvlJc w:val="left"/>
+      <w:pPr>
+        <w:ind w:left="4320" w:hanging="360"/>
+      </w:pPr>
+      <w:rPr>
+        <w:rFonts w:ascii="Wingdings" w:hAnsi="Wingdings" w:hint="default"/>
+      </w:rPr>
+    </w:lvl>
+    <w:lvl w:ilvl="6" w:tplc="04090001" w:tentative="1">
+      <w:start w:val="1"/>
+      <w:numFmt w:val="bullet"/>
+      <w:lvlText w:val=""/>
+      <w:lvlJc w:val="left"/>
+      <w:pPr>
+        <w:ind w:left="5040" w:hanging="360"/>
+      </w:pPr>
+      <w:rPr>
+        <w:rFonts w:ascii="Symbol" w:hAnsi="Symbol" w:hint="default"/>
+      </w:rPr>
+    </w:lvl>
+    <w:lvl w:ilvl="7" w:tplc="04090003" w:tentative="1">
+      <w:start w:val="1"/>
+      <w:numFmt w:val="bullet"/>
+      <w:lvlText w:val="o"/>
+      <w:lvlJc w:val="left"/>
+      <w:pPr>
+        <w:ind w:left="5760" w:hanging="360"/>
+      </w:pPr>
+      <w:rPr>
+        <w:rFonts w:ascii="Courier New" w:hAnsi="Courier New" w:cs="Courier New" w:hint="default"/>
+      </w:rPr>
+    </w:lvl>
+    <w:lvl w:ilvl="8" w:tplc="04090005" w:tentative="1">
+      <w:start w:val="1"/>
+      <w:numFmt w:val="bullet"/>
+      <w:lvlText w:val=""/>
+      <w:lvlJc w:val="left"/>
+      <w:pPr>
+        <w:ind w:left="6480" w:hanging="360"/>
+      </w:pPr>
+      <w:rPr>
+        <w:rFonts w:ascii="Wingdings" w:hAnsi="Wingdings" w:hint="default"/>
+      </w:rPr>
+    </w:lvl>
+  </w:abstractNum>
+  <w:abstractNum w:abstractNumId="10" w15:restartNumberingAfterBreak="0">
     <w:nsid w:val="1BC04CAA"/>
     <w:multiLevelType w:val="multilevel"/>
     <w:tmpl w:val="988E0238"/>
@@ -3218,7 +3819,7 @@
       </w:rPr>
     </w:lvl>
   </w:abstractNum>
-  <w:abstractNum w:abstractNumId="10" w15:restartNumberingAfterBreak="0">
+  <w:abstractNum w:abstractNumId="11" w15:restartNumberingAfterBreak="0">
     <w:nsid w:val="1C7028D5"/>
     <w:multiLevelType w:val="multilevel"/>
     <w:tmpl w:val="4170CB6E"/>
@@ -3367,7 +3968,7 @@
       </w:rPr>
     </w:lvl>
   </w:abstractNum>
-  <w:abstractNum w:abstractNumId="11" w15:restartNumberingAfterBreak="0">
+  <w:abstractNum w:abstractNumId="12" w15:restartNumberingAfterBreak="0">
     <w:nsid w:val="24E93AAF"/>
     <w:multiLevelType w:val="multilevel"/>
     <w:tmpl w:val="01349A7E"/>
@@ -3516,7 +4117,120 @@
       </w:rPr>
     </w:lvl>
   </w:abstractNum>
-  <w:abstractNum w:abstractNumId="12" w15:restartNumberingAfterBreak="0">
+  <w:abstractNum w:abstractNumId="13" w15:restartNumberingAfterBreak="0">
+    <w:nsid w:val="272D33EA"/>
+    <w:multiLevelType w:val="hybridMultilevel"/>
+    <w:tmpl w:val="B328AE88"/>
+    <w:lvl w:ilvl="0" w:tplc="04090001">
+      <w:start w:val="1"/>
+      <w:numFmt w:val="bullet"/>
+      <w:lvlText w:val=""/>
+      <w:lvlJc w:val="left"/>
+      <w:pPr>
+        <w:ind w:left="720" w:hanging="360"/>
+      </w:pPr>
+      <w:rPr>
+        <w:rFonts w:ascii="Symbol" w:hAnsi="Symbol" w:hint="default"/>
+      </w:rPr>
+    </w:lvl>
+    <w:lvl w:ilvl="1" w:tplc="04090003" w:tentative="1">
+      <w:start w:val="1"/>
+      <w:numFmt w:val="bullet"/>
+      <w:lvlText w:val="o"/>
+      <w:lvlJc w:val="left"/>
+      <w:pPr>
+        <w:ind w:left="1440" w:hanging="360"/>
+      </w:pPr>
+      <w:rPr>
+        <w:rFonts w:ascii="Courier New" w:hAnsi="Courier New" w:cs="Courier New" w:hint="default"/>
+      </w:rPr>
+    </w:lvl>
+    <w:lvl w:ilvl="2" w:tplc="04090005" w:tentative="1">
+      <w:start w:val="1"/>
+      <w:numFmt w:val="bullet"/>
+      <w:lvlText w:val=""/>
+      <w:lvlJc w:val="left"/>
+      <w:pPr>
+        <w:ind w:left="2160" w:hanging="360"/>
+      </w:pPr>
+      <w:rPr>
+        <w:rFonts w:ascii="Wingdings" w:hAnsi="Wingdings" w:hint="default"/>
+      </w:rPr>
+    </w:lvl>
+    <w:lvl w:ilvl="3" w:tplc="04090001" w:tentative="1">
+      <w:start w:val="1"/>
+      <w:numFmt w:val="bullet"/>
+      <w:lvlText w:val=""/>
+      <w:lvlJc w:val="left"/>
+      <w:pPr>
+        <w:ind w:left="2880" w:hanging="360"/>
+      </w:pPr>
+      <w:rPr>
+        <w:rFonts w:ascii="Symbol" w:hAnsi="Symbol" w:hint="default"/>
+      </w:rPr>
+    </w:lvl>
+    <w:lvl w:ilvl="4" w:tplc="04090003" w:tentative="1">
+      <w:start w:val="1"/>
+      <w:numFmt w:val="bullet"/>
+      <w:lvlText w:val="o"/>
+      <w:lvlJc w:val="left"/>
+      <w:pPr>
+        <w:ind w:left="3600" w:hanging="360"/>
+      </w:pPr>
+      <w:rPr>
+        <w:rFonts w:ascii="Courier New" w:hAnsi="Courier New" w:cs="Courier New" w:hint="default"/>
+      </w:rPr>
+    </w:lvl>
+    <w:lvl w:ilvl="5" w:tplc="04090005" w:tentative="1">
+      <w:start w:val="1"/>
+      <w:numFmt w:val="bullet"/>
+      <w:lvlText w:val=""/>
+      <w:lvlJc w:val="left"/>
+      <w:pPr>
+        <w:ind w:left="4320" w:hanging="360"/>
+      </w:pPr>
+      <w:rPr>
+        <w:rFonts w:ascii="Wingdings" w:hAnsi="Wingdings" w:hint="default"/>
+      </w:rPr>
+    </w:lvl>
+    <w:lvl w:ilvl="6" w:tplc="04090001" w:tentative="1">
+      <w:start w:val="1"/>
+      <w:numFmt w:val="bullet"/>
+      <w:lvlText w:val=""/>
+      <w:lvlJc w:val="left"/>
+      <w:pPr>
+        <w:ind w:left="5040" w:hanging="360"/>
+      </w:pPr>
+      <w:rPr>
+        <w:rFonts w:ascii="Symbol" w:hAnsi="Symbol" w:hint="default"/>
+      </w:rPr>
+    </w:lvl>
+    <w:lvl w:ilvl="7" w:tplc="04090003" w:tentative="1">
+      <w:start w:val="1"/>
+      <w:numFmt w:val="bullet"/>
+      <w:lvlText w:val="o"/>
+      <w:lvlJc w:val="left"/>
+      <w:pPr>
+        <w:ind w:left="5760" w:hanging="360"/>
+      </w:pPr>
+      <w:rPr>
+        <w:rFonts w:ascii="Courier New" w:hAnsi="Courier New" w:cs="Courier New" w:hint="default"/>
+      </w:rPr>
+    </w:lvl>
+    <w:lvl w:ilvl="8" w:tplc="04090005" w:tentative="1">
+      <w:start w:val="1"/>
+      <w:numFmt w:val="bullet"/>
+      <w:lvlText w:val=""/>
+      <w:lvlJc w:val="left"/>
+      <w:pPr>
+        <w:ind w:left="6480" w:hanging="360"/>
+      </w:pPr>
+      <w:rPr>
+        <w:rFonts w:ascii="Wingdings" w:hAnsi="Wingdings" w:hint="default"/>
+      </w:rPr>
+    </w:lvl>
+  </w:abstractNum>
+  <w:abstractNum w:abstractNumId="14" w15:restartNumberingAfterBreak="0">
     <w:nsid w:val="28BC710F"/>
     <w:multiLevelType w:val="multilevel"/>
     <w:tmpl w:val="15D25D34"/>
@@ -3665,7 +4379,7 @@
       </w:rPr>
     </w:lvl>
   </w:abstractNum>
-  <w:abstractNum w:abstractNumId="13" w15:restartNumberingAfterBreak="0">
+  <w:abstractNum w:abstractNumId="15" w15:restartNumberingAfterBreak="0">
     <w:nsid w:val="2F0C2B78"/>
     <w:multiLevelType w:val="multilevel"/>
     <w:tmpl w:val="A58EBD76"/>
@@ -3814,7 +4528,7 @@
       </w:rPr>
     </w:lvl>
   </w:abstractNum>
-  <w:abstractNum w:abstractNumId="14" w15:restartNumberingAfterBreak="0">
+  <w:abstractNum w:abstractNumId="16" w15:restartNumberingAfterBreak="0">
     <w:nsid w:val="307F2786"/>
     <w:multiLevelType w:val="multilevel"/>
     <w:tmpl w:val="F8B61FB6"/>
@@ -3963,7 +4677,7 @@
       </w:rPr>
     </w:lvl>
   </w:abstractNum>
-  <w:abstractNum w:abstractNumId="15" w15:restartNumberingAfterBreak="0">
+  <w:abstractNum w:abstractNumId="17" w15:restartNumberingAfterBreak="0">
     <w:nsid w:val="309B6090"/>
     <w:multiLevelType w:val="multilevel"/>
     <w:tmpl w:val="9BCC87D2"/>
@@ -4112,7 +4826,7 @@
       </w:rPr>
     </w:lvl>
   </w:abstractNum>
-  <w:abstractNum w:abstractNumId="16" w15:restartNumberingAfterBreak="0">
+  <w:abstractNum w:abstractNumId="18" w15:restartNumberingAfterBreak="0">
     <w:nsid w:val="36215D75"/>
     <w:multiLevelType w:val="multilevel"/>
     <w:tmpl w:val="350674AA"/>
@@ -4261,7 +4975,7 @@
       </w:rPr>
     </w:lvl>
   </w:abstractNum>
-  <w:abstractNum w:abstractNumId="17" w15:restartNumberingAfterBreak="0">
+  <w:abstractNum w:abstractNumId="19" w15:restartNumberingAfterBreak="0">
     <w:nsid w:val="36534654"/>
     <w:multiLevelType w:val="multilevel"/>
     <w:tmpl w:val="7D0217EE"/>
@@ -4410,7 +5124,7 @@
       </w:rPr>
     </w:lvl>
   </w:abstractNum>
-  <w:abstractNum w:abstractNumId="18" w15:restartNumberingAfterBreak="0">
+  <w:abstractNum w:abstractNumId="20" w15:restartNumberingAfterBreak="0">
     <w:nsid w:val="37951290"/>
     <w:multiLevelType w:val="multilevel"/>
     <w:tmpl w:val="AB06921A"/>
@@ -4559,7 +5273,7 @@
       </w:rPr>
     </w:lvl>
   </w:abstractNum>
-  <w:abstractNum w:abstractNumId="19" w15:restartNumberingAfterBreak="0">
+  <w:abstractNum w:abstractNumId="21" w15:restartNumberingAfterBreak="0">
     <w:nsid w:val="39FA64E1"/>
     <w:multiLevelType w:val="multilevel"/>
     <w:tmpl w:val="9CD07F88"/>
@@ -4708,7 +5422,7 @@
       </w:rPr>
     </w:lvl>
   </w:abstractNum>
-  <w:abstractNum w:abstractNumId="20" w15:restartNumberingAfterBreak="0">
+  <w:abstractNum w:abstractNumId="22" w15:restartNumberingAfterBreak="0">
     <w:nsid w:val="3CC47552"/>
     <w:multiLevelType w:val="multilevel"/>
     <w:tmpl w:val="498CF08C"/>
@@ -4857,7 +5571,7 @@
       </w:rPr>
     </w:lvl>
   </w:abstractNum>
-  <w:abstractNum w:abstractNumId="21" w15:restartNumberingAfterBreak="0">
+  <w:abstractNum w:abstractNumId="23" w15:restartNumberingAfterBreak="0">
     <w:nsid w:val="40AD6808"/>
     <w:multiLevelType w:val="multilevel"/>
     <w:tmpl w:val="A6708BA0"/>
@@ -5006,7 +5720,7 @@
       </w:rPr>
     </w:lvl>
   </w:abstractNum>
-  <w:abstractNum w:abstractNumId="22" w15:restartNumberingAfterBreak="0">
+  <w:abstractNum w:abstractNumId="24" w15:restartNumberingAfterBreak="0">
     <w:nsid w:val="451E5A7A"/>
     <w:multiLevelType w:val="multilevel"/>
     <w:tmpl w:val="6EDA2598"/>
@@ -5155,7 +5869,7 @@
       </w:rPr>
     </w:lvl>
   </w:abstractNum>
-  <w:abstractNum w:abstractNumId="23" w15:restartNumberingAfterBreak="0">
+  <w:abstractNum w:abstractNumId="25" w15:restartNumberingAfterBreak="0">
     <w:nsid w:val="54F5025B"/>
     <w:multiLevelType w:val="multilevel"/>
     <w:tmpl w:val="098CB1CE"/>
@@ -5304,7 +6018,7 @@
       </w:rPr>
     </w:lvl>
   </w:abstractNum>
-  <w:abstractNum w:abstractNumId="24" w15:restartNumberingAfterBreak="0">
+  <w:abstractNum w:abstractNumId="26" w15:restartNumberingAfterBreak="0">
     <w:nsid w:val="56AC5B1D"/>
     <w:multiLevelType w:val="multilevel"/>
     <w:tmpl w:val="5B008296"/>
@@ -5453,7 +6167,7 @@
       </w:rPr>
     </w:lvl>
   </w:abstractNum>
-  <w:abstractNum w:abstractNumId="25" w15:restartNumberingAfterBreak="0">
+  <w:abstractNum w:abstractNumId="27" w15:restartNumberingAfterBreak="0">
     <w:nsid w:val="65D270CD"/>
     <w:multiLevelType w:val="multilevel"/>
     <w:tmpl w:val="50C282D8"/>
@@ -5602,7 +6316,7 @@
       </w:rPr>
     </w:lvl>
   </w:abstractNum>
-  <w:abstractNum w:abstractNumId="26" w15:restartNumberingAfterBreak="0">
+  <w:abstractNum w:abstractNumId="28" w15:restartNumberingAfterBreak="0">
     <w:nsid w:val="721C65A7"/>
     <w:multiLevelType w:val="multilevel"/>
     <w:tmpl w:val="0F6868FE"/>
@@ -5751,7 +6465,7 @@
       </w:rPr>
     </w:lvl>
   </w:abstractNum>
-  <w:abstractNum w:abstractNumId="27" w15:restartNumberingAfterBreak="0">
+  <w:abstractNum w:abstractNumId="29" w15:restartNumberingAfterBreak="0">
     <w:nsid w:val="73401E98"/>
     <w:multiLevelType w:val="multilevel"/>
     <w:tmpl w:val="B0F65E14"/>
@@ -5900,7 +6614,7 @@
       </w:rPr>
     </w:lvl>
   </w:abstractNum>
-  <w:abstractNum w:abstractNumId="28" w15:restartNumberingAfterBreak="0">
+  <w:abstractNum w:abstractNumId="30" w15:restartNumberingAfterBreak="0">
     <w:nsid w:val="77B2470F"/>
     <w:multiLevelType w:val="multilevel"/>
     <w:tmpl w:val="C0CC00FE"/>
@@ -6049,7 +6763,120 @@
       </w:rPr>
     </w:lvl>
   </w:abstractNum>
-  <w:abstractNum w:abstractNumId="29" w15:restartNumberingAfterBreak="0">
+  <w:abstractNum w:abstractNumId="31" w15:restartNumberingAfterBreak="0">
+    <w:nsid w:val="7D3705B8"/>
+    <w:multiLevelType w:val="hybridMultilevel"/>
+    <w:tmpl w:val="266E9EE6"/>
+    <w:lvl w:ilvl="0" w:tplc="04090001">
+      <w:start w:val="1"/>
+      <w:numFmt w:val="bullet"/>
+      <w:lvlText w:val=""/>
+      <w:lvlJc w:val="left"/>
+      <w:pPr>
+        <w:ind w:left="720" w:hanging="360"/>
+      </w:pPr>
+      <w:rPr>
+        <w:rFonts w:ascii="Symbol" w:hAnsi="Symbol" w:hint="default"/>
+      </w:rPr>
+    </w:lvl>
+    <w:lvl w:ilvl="1" w:tplc="04090003" w:tentative="1">
+      <w:start w:val="1"/>
+      <w:numFmt w:val="bullet"/>
+      <w:lvlText w:val="o"/>
+      <w:lvlJc w:val="left"/>
+      <w:pPr>
+        <w:ind w:left="1440" w:hanging="360"/>
+      </w:pPr>
+      <w:rPr>
+        <w:rFonts w:ascii="Courier New" w:hAnsi="Courier New" w:cs="Courier New" w:hint="default"/>
+      </w:rPr>
+    </w:lvl>
+    <w:lvl w:ilvl="2" w:tplc="04090005" w:tentative="1">
+      <w:start w:val="1"/>
+      <w:numFmt w:val="bullet"/>
+      <w:lvlText w:val=""/>
+      <w:lvlJc w:val="left"/>
+      <w:pPr>
+        <w:ind w:left="2160" w:hanging="360"/>
+      </w:pPr>
+      <w:rPr>
+        <w:rFonts w:ascii="Wingdings" w:hAnsi="Wingdings" w:hint="default"/>
+      </w:rPr>
+    </w:lvl>
+    <w:lvl w:ilvl="3" w:tplc="04090001" w:tentative="1">
+      <w:start w:val="1"/>
+      <w:numFmt w:val="bullet"/>
+      <w:lvlText w:val=""/>
+      <w:lvlJc w:val="left"/>
+      <w:pPr>
+        <w:ind w:left="2880" w:hanging="360"/>
+      </w:pPr>
+      <w:rPr>
+        <w:rFonts w:ascii="Symbol" w:hAnsi="Symbol" w:hint="default"/>
+      </w:rPr>
+    </w:lvl>
+    <w:lvl w:ilvl="4" w:tplc="04090003" w:tentative="1">
+      <w:start w:val="1"/>
+      <w:numFmt w:val="bullet"/>
+      <w:lvlText w:val="o"/>
+      <w:lvlJc w:val="left"/>
+      <w:pPr>
+        <w:ind w:left="3600" w:hanging="360"/>
+      </w:pPr>
+      <w:rPr>
+        <w:rFonts w:ascii="Courier New" w:hAnsi="Courier New" w:cs="Courier New" w:hint="default"/>
+      </w:rPr>
+    </w:lvl>
+    <w:lvl w:ilvl="5" w:tplc="04090005" w:tentative="1">
+      <w:start w:val="1"/>
+      <w:numFmt w:val="bullet"/>
+      <w:lvlText w:val=""/>
+      <w:lvlJc w:val="left"/>
+      <w:pPr>
+        <w:ind w:left="4320" w:hanging="360"/>
+      </w:pPr>
+      <w:rPr>
+        <w:rFonts w:ascii="Wingdings" w:hAnsi="Wingdings" w:hint="default"/>
+      </w:rPr>
+    </w:lvl>
+    <w:lvl w:ilvl="6" w:tplc="04090001" w:tentative="1">
+      <w:start w:val="1"/>
+      <w:numFmt w:val="bullet"/>
+      <w:lvlText w:val=""/>
+      <w:lvlJc w:val="left"/>
+      <w:pPr>
+        <w:ind w:left="5040" w:hanging="360"/>
+      </w:pPr>
+      <w:rPr>
+        <w:rFonts w:ascii="Symbol" w:hAnsi="Symbol" w:hint="default"/>
+      </w:rPr>
+    </w:lvl>
+    <w:lvl w:ilvl="7" w:tplc="04090003" w:tentative="1">
+      <w:start w:val="1"/>
+      <w:numFmt w:val="bullet"/>
+      <w:lvlText w:val="o"/>
+      <w:lvlJc w:val="left"/>
+      <w:pPr>
+        <w:ind w:left="5760" w:hanging="360"/>
+      </w:pPr>
+      <w:rPr>
+        <w:rFonts w:ascii="Courier New" w:hAnsi="Courier New" w:cs="Courier New" w:hint="default"/>
+      </w:rPr>
+    </w:lvl>
+    <w:lvl w:ilvl="8" w:tplc="04090005" w:tentative="1">
+      <w:start w:val="1"/>
+      <w:numFmt w:val="bullet"/>
+      <w:lvlText w:val=""/>
+      <w:lvlJc w:val="left"/>
+      <w:pPr>
+        <w:ind w:left="6480" w:hanging="360"/>
+      </w:pPr>
+      <w:rPr>
+        <w:rFonts w:ascii="Wingdings" w:hAnsi="Wingdings" w:hint="default"/>
+      </w:rPr>
+    </w:lvl>
+  </w:abstractNum>
+  <w:abstractNum w:abstractNumId="32" w15:restartNumberingAfterBreak="0">
     <w:nsid w:val="7DF90852"/>
     <w:multiLevelType w:val="multilevel"/>
     <w:tmpl w:val="C05CFA50"/>
@@ -6198,11 +7025,124 @@
       </w:rPr>
     </w:lvl>
   </w:abstractNum>
+  <w:abstractNum w:abstractNumId="33" w15:restartNumberingAfterBreak="0">
+    <w:nsid w:val="7E5131F2"/>
+    <w:multiLevelType w:val="hybridMultilevel"/>
+    <w:tmpl w:val="81FAC9BA"/>
+    <w:lvl w:ilvl="0" w:tplc="04090001">
+      <w:start w:val="1"/>
+      <w:numFmt w:val="bullet"/>
+      <w:lvlText w:val=""/>
+      <w:lvlJc w:val="left"/>
+      <w:pPr>
+        <w:ind w:left="720" w:hanging="360"/>
+      </w:pPr>
+      <w:rPr>
+        <w:rFonts w:ascii="Symbol" w:hAnsi="Symbol" w:hint="default"/>
+      </w:rPr>
+    </w:lvl>
+    <w:lvl w:ilvl="1" w:tplc="04090003" w:tentative="1">
+      <w:start w:val="1"/>
+      <w:numFmt w:val="bullet"/>
+      <w:lvlText w:val="o"/>
+      <w:lvlJc w:val="left"/>
+      <w:pPr>
+        <w:ind w:left="1440" w:hanging="360"/>
+      </w:pPr>
+      <w:rPr>
+        <w:rFonts w:ascii="Courier New" w:hAnsi="Courier New" w:cs="Courier New" w:hint="default"/>
+      </w:rPr>
+    </w:lvl>
+    <w:lvl w:ilvl="2" w:tplc="04090005" w:tentative="1">
+      <w:start w:val="1"/>
+      <w:numFmt w:val="bullet"/>
+      <w:lvlText w:val=""/>
+      <w:lvlJc w:val="left"/>
+      <w:pPr>
+        <w:ind w:left="2160" w:hanging="360"/>
+      </w:pPr>
+      <w:rPr>
+        <w:rFonts w:ascii="Wingdings" w:hAnsi="Wingdings" w:hint="default"/>
+      </w:rPr>
+    </w:lvl>
+    <w:lvl w:ilvl="3" w:tplc="04090001" w:tentative="1">
+      <w:start w:val="1"/>
+      <w:numFmt w:val="bullet"/>
+      <w:lvlText w:val=""/>
+      <w:lvlJc w:val="left"/>
+      <w:pPr>
+        <w:ind w:left="2880" w:hanging="360"/>
+      </w:pPr>
+      <w:rPr>
+        <w:rFonts w:ascii="Symbol" w:hAnsi="Symbol" w:hint="default"/>
+      </w:rPr>
+    </w:lvl>
+    <w:lvl w:ilvl="4" w:tplc="04090003" w:tentative="1">
+      <w:start w:val="1"/>
+      <w:numFmt w:val="bullet"/>
+      <w:lvlText w:val="o"/>
+      <w:lvlJc w:val="left"/>
+      <w:pPr>
+        <w:ind w:left="3600" w:hanging="360"/>
+      </w:pPr>
+      <w:rPr>
+        <w:rFonts w:ascii="Courier New" w:hAnsi="Courier New" w:cs="Courier New" w:hint="default"/>
+      </w:rPr>
+    </w:lvl>
+    <w:lvl w:ilvl="5" w:tplc="04090005" w:tentative="1">
+      <w:start w:val="1"/>
+      <w:numFmt w:val="bullet"/>
+      <w:lvlText w:val=""/>
+      <w:lvlJc w:val="left"/>
+      <w:pPr>
+        <w:ind w:left="4320" w:hanging="360"/>
+      </w:pPr>
+      <w:rPr>
+        <w:rFonts w:ascii="Wingdings" w:hAnsi="Wingdings" w:hint="default"/>
+      </w:rPr>
+    </w:lvl>
+    <w:lvl w:ilvl="6" w:tplc="04090001" w:tentative="1">
+      <w:start w:val="1"/>
+      <w:numFmt w:val="bullet"/>
+      <w:lvlText w:val=""/>
+      <w:lvlJc w:val="left"/>
+      <w:pPr>
+        <w:ind w:left="5040" w:hanging="360"/>
+      </w:pPr>
+      <w:rPr>
+        <w:rFonts w:ascii="Symbol" w:hAnsi="Symbol" w:hint="default"/>
+      </w:rPr>
+    </w:lvl>
+    <w:lvl w:ilvl="7" w:tplc="04090003" w:tentative="1">
+      <w:start w:val="1"/>
+      <w:numFmt w:val="bullet"/>
+      <w:lvlText w:val="o"/>
+      <w:lvlJc w:val="left"/>
+      <w:pPr>
+        <w:ind w:left="5760" w:hanging="360"/>
+      </w:pPr>
+      <w:rPr>
+        <w:rFonts w:ascii="Courier New" w:hAnsi="Courier New" w:cs="Courier New" w:hint="default"/>
+      </w:rPr>
+    </w:lvl>
+    <w:lvl w:ilvl="8" w:tplc="04090005" w:tentative="1">
+      <w:start w:val="1"/>
+      <w:numFmt w:val="bullet"/>
+      <w:lvlText w:val=""/>
+      <w:lvlJc w:val="left"/>
+      <w:pPr>
+        <w:ind w:left="6480" w:hanging="360"/>
+      </w:pPr>
+      <w:rPr>
+        <w:rFonts w:ascii="Wingdings" w:hAnsi="Wingdings" w:hint="default"/>
+      </w:rPr>
+    </w:lvl>
+  </w:abstractNum>
   <w:num w:numId="1" w16cid:durableId="1488087076">
-    <w:abstractNumId w:val="22"/>
+    <w:abstractNumId w:val="24"/>
   </w:num>
   <w:num w:numId="2" w16cid:durableId="1534734111">
-    <w:abstractNumId w:val="27"/>
+    <w:abstractNumId w:val="29"/>
   </w:num>
   <w:num w:numId="3" w16cid:durableId="2005357336">
     <w:abstractNumId w:val="1"/>
@@ -6211,19 +7151,19 @@
     <w:abstractNumId w:val="0"/>
   </w:num>
   <w:num w:numId="5" w16cid:durableId="1708480326">
+    <w:abstractNumId w:val="11"/>
+  </w:num>
+  <w:num w:numId="6" w16cid:durableId="162286143">
+    <w:abstractNumId w:val="27"/>
+  </w:num>
+  <w:num w:numId="7" w16cid:durableId="912471052">
     <w:abstractNumId w:val="10"/>
   </w:num>
-  <w:num w:numId="6" w16cid:durableId="162286143">
-    <w:abstractNumId w:val="25"/>
-  </w:num>
-  <w:num w:numId="7" w16cid:durableId="912471052">
-    <w:abstractNumId w:val="9"/>
-  </w:num>
   <w:num w:numId="8" w16cid:durableId="88696573">
-    <w:abstractNumId w:val="14"/>
+    <w:abstractNumId w:val="16"/>
   </w:num>
   <w:num w:numId="9" w16cid:durableId="2042432527">
-    <w:abstractNumId w:val="20"/>
+    <w:abstractNumId w:val="22"/>
   </w:num>
   <w:num w:numId="10" w16cid:durableId="450591065">
     <w:abstractNumId w:val="7"/>
@@ -6232,34 +7172,34 @@
     <w:abstractNumId w:val="6"/>
   </w:num>
   <w:num w:numId="12" w16cid:durableId="1207836878">
-    <w:abstractNumId w:val="18"/>
+    <w:abstractNumId w:val="20"/>
   </w:num>
   <w:num w:numId="13" w16cid:durableId="652685451">
-    <w:abstractNumId w:val="17"/>
+    <w:abstractNumId w:val="19"/>
   </w:num>
   <w:num w:numId="14" w16cid:durableId="936213926">
-    <w:abstractNumId w:val="29"/>
+    <w:abstractNumId w:val="32"/>
   </w:num>
   <w:num w:numId="15" w16cid:durableId="370768001">
-    <w:abstractNumId w:val="12"/>
+    <w:abstractNumId w:val="14"/>
   </w:num>
   <w:num w:numId="16" w16cid:durableId="4089980">
-    <w:abstractNumId w:val="13"/>
+    <w:abstractNumId w:val="15"/>
   </w:num>
   <w:num w:numId="17" w16cid:durableId="306320976">
-    <w:abstractNumId w:val="19"/>
+    <w:abstractNumId w:val="21"/>
   </w:num>
   <w:num w:numId="18" w16cid:durableId="2138985747">
-    <w:abstractNumId w:val="21"/>
+    <w:abstractNumId w:val="23"/>
   </w:num>
   <w:num w:numId="19" w16cid:durableId="1129863130">
-    <w:abstractNumId w:val="28"/>
+    <w:abstractNumId w:val="30"/>
   </w:num>
   <w:num w:numId="20" w16cid:durableId="426390282">
     <w:abstractNumId w:val="3"/>
   </w:num>
   <w:num w:numId="21" w16cid:durableId="1764180102">
-    <w:abstractNumId w:val="23"/>
+    <w:abstractNumId w:val="25"/>
   </w:num>
   <w:num w:numId="22" w16cid:durableId="1319576307">
     <w:abstractNumId w:val="4"/>
@@ -6268,25 +7208,37 @@
     <w:abstractNumId w:val="2"/>
   </w:num>
   <w:num w:numId="24" w16cid:durableId="2034988725">
-    <w:abstractNumId w:val="15"/>
+    <w:abstractNumId w:val="17"/>
   </w:num>
   <w:num w:numId="25" w16cid:durableId="509105357">
-    <w:abstractNumId w:val="24"/>
+    <w:abstractNumId w:val="26"/>
   </w:num>
   <w:num w:numId="26" w16cid:durableId="1696033458">
     <w:abstractNumId w:val="8"/>
   </w:num>
   <w:num w:numId="27" w16cid:durableId="934674489">
-    <w:abstractNumId w:val="26"/>
+    <w:abstractNumId w:val="28"/>
   </w:num>
   <w:num w:numId="28" w16cid:durableId="274486595">
-    <w:abstractNumId w:val="16"/>
+    <w:abstractNumId w:val="18"/>
   </w:num>
   <w:num w:numId="29" w16cid:durableId="651063890">
-    <w:abstractNumId w:val="11"/>
+    <w:abstractNumId w:val="12"/>
   </w:num>
   <w:num w:numId="30" w16cid:durableId="1432704091">
     <w:abstractNumId w:val="5"/>
+  </w:num>
+  <w:num w:numId="31" w16cid:durableId="1790662045">
+    <w:abstractNumId w:val="13"/>
+  </w:num>
+  <w:num w:numId="32" w16cid:durableId="111898407">
+    <w:abstractNumId w:val="31"/>
+  </w:num>
+  <w:num w:numId="33" w16cid:durableId="969744946">
+    <w:abstractNumId w:val="9"/>
+  </w:num>
+  <w:num w:numId="34" w16cid:durableId="769621070">
+    <w:abstractNumId w:val="33"/>
   </w:num>
 </w:numbering>
 </file>

</xml_diff>